<commit_message>
Legal docs: bump all three 'Last Updated' to July 8 2026 so ToS/Privacy/Cookie match; refresh legal-review .docx copies
Co-Authored-By: Claude Opus 4.8 <noreply@anthropic.com>
</commit_message>
<xml_diff>
--- a/legal-review/Lendie-Privacy-Policy.docx
+++ b/legal-review/Lendie-Privacy-Policy.docx
@@ -42,7 +42,7 @@
           <w:spacing w:val="0"/>
           <w:color w:val="525458"/>
         </w:rPr>
-        <w:t xml:space="preserve">Effective Date: June 8, 2025  ·  Last Updated: July 3, 2026</w:t>
+        <w:t xml:space="preserve">Effective Date: June 8, 2025  ·  Last Updated: July 8, 2026</w:t>
       </w:r>
     </w:p>
     <w:p>
@@ -2568,6 +2568,26 @@
           <w:color w:val="16AD82"/>
         </w:rPr>
         <w:t xml:space="preserve">Terms of Service</w:t>
+      </w:r>
+      <w:r>
+        <w:rPr>
+          <w:rFonts w:ascii="Helvetica Neue" w:hAnsi="Helvetica Neue" w:cs="Helvetica Neue"/>
+          <w:sz w:val="26"/>
+          <w:sz-cs w:val="26"/>
+          <w:spacing w:val="0"/>
+          <w:color w:val="525458"/>
+        </w:rPr>
+        <w:t xml:space="preserve">  ·  </w:t>
+      </w:r>
+      <w:r>
+        <w:rPr>
+          <w:rFonts w:ascii="Helvetica Neue" w:hAnsi="Helvetica Neue" w:cs="Helvetica Neue"/>
+          <w:sz w:val="26"/>
+          <w:sz-cs w:val="26"/>
+          <w:spacing w:val="0"/>
+          <w:color w:val="16AD82"/>
+        </w:rPr>
+        <w:t xml:space="preserve">Cookie Policy</w:t>
       </w:r>
       <w:r>
         <w:rPr>

</xml_diff>